<commit_message>
Improve accounting connectors, connected tax workflows and verification
</commit_message>
<xml_diff>
--- a/docs/phase-8/export-evidence/synthetic-localfile.docx
+++ b/docs/phase-8/export-evidence/synthetic-localfile.docx
@@ -27,17 +27,17 @@
     </w:p>
     <w:p>
       <w:r>
-        <w:t>Immutable calculation: 2291dec1-87b3-44cd-8605-870600cab9b3. Methodology: auditos-tp/1.0.</w:t>
+        <w:t>Immutable calculation: ecfbb0fa-ebfc-407e-89ba-d1ce4da270fd. Methodology: auditos-tp/1.0.</w:t>
       </w:r>
     </w:p>
     <w:p>
       <w:r>
-        <w:t>Approved financial source: 228036ce-c084-44b7-a0e5-d7eaf489b6a8. Source profit: 1200000.00000000.</w:t>
+        <w:t>Approved financial source: c294c0ff-8c6f-4dff-8375-8f99c9058ca4. Source profit: 1200000.00000000.</w:t>
       </w:r>
     </w:p>
     <w:p>
       <w:r>
-        <w:t>Financial reconciliation: 5b01ace9-0e29-42f5-947e-ba63d26a9585.</w:t>
+        <w:t>Financial reconciliation: 5361f161-7a01-4173-a92e-a24f2285d076.</w:t>
       </w:r>
     </w:p>
     <w:p>
@@ -61,7 +61,7 @@
         <w:keepNext w:val="0"/>
       </w:pPr>
       <w:r>
-        <w:t>Reviewed source references: 74795bc1-871f-4bd2-90ec-7960aa8f7d68</w:t>
+        <w:t>Reviewed source references: 383073ea-6483-447a-8c74-fb38b6226a58</w:t>
       </w:r>
     </w:p>
     <w:p>
@@ -85,7 +85,7 @@
         <w:keepNext w:val="0"/>
       </w:pPr>
       <w:r>
-        <w:t>Reviewed source references: 74795bc1-871f-4bd2-90ec-7960aa8f7d68</w:t>
+        <w:t>Reviewed source references: 383073ea-6483-447a-8c74-fb38b6226a58</w:t>
       </w:r>
     </w:p>
     <w:p>
@@ -109,7 +109,7 @@
         <w:keepNext w:val="0"/>
       </w:pPr>
       <w:r>
-        <w:t>Reviewed source references: 74795bc1-871f-4bd2-90ec-7960aa8f7d68</w:t>
+        <w:t>Reviewed source references: 383073ea-6483-447a-8c74-fb38b6226a58</w:t>
       </w:r>
     </w:p>
     <w:p>
@@ -133,7 +133,7 @@
         <w:keepNext w:val="0"/>
       </w:pPr>
       <w:r>
-        <w:t>Reviewed source references: 74795bc1-871f-4bd2-90ec-7960aa8f7d68</w:t>
+        <w:t>Reviewed source references: 383073ea-6483-447a-8c74-fb38b6226a58</w:t>
       </w:r>
     </w:p>
     <w:p>
@@ -157,7 +157,7 @@
         <w:keepNext w:val="0"/>
       </w:pPr>
       <w:r>
-        <w:t>Reviewed source references: 74795bc1-871f-4bd2-90ec-7960aa8f7d68</w:t>
+        <w:t>Reviewed source references: 383073ea-6483-447a-8c74-fb38b6226a58</w:t>
       </w:r>
     </w:p>
     <w:p>
@@ -181,12 +181,12 @@
         <w:keepNext/>
       </w:pPr>
       <w:r>
-        <w:t>Reviewed source references: 74795bc1-871f-4bd2-90ec-7960aa8f7d68</w:t>
+        <w:t>Reviewed source references: 383073ea-6483-447a-8c74-fb38b6226a58</w:t>
       </w:r>
     </w:p>
     <w:p>
       <w:r>
-        <w:t>Calculation references: f7a5b6be-7a26-46cd-bd88-2dd52b1d11cd</w:t>
+        <w:t>Calculation references: 9f1251fa-b233-4ecd-9d23-99b681941173</w:t>
       </w:r>
     </w:p>
     <w:p>
@@ -210,7 +210,7 @@
         <w:keepNext w:val="0"/>
       </w:pPr>
       <w:r>
-        <w:t>Reviewed source references: 74795bc1-871f-4bd2-90ec-7960aa8f7d68</w:t>
+        <w:t>Reviewed source references: 383073ea-6483-447a-8c74-fb38b6226a58</w:t>
       </w:r>
     </w:p>
     <w:p>
@@ -234,7 +234,7 @@
         <w:keepNext w:val="0"/>
       </w:pPr>
       <w:r>
-        <w:t>Reviewed source references: e9050afd-6a88-42fd-a0df-d3c17cb3ed6a</w:t>
+        <w:t>Reviewed source references: fdb9fdcd-b9c1-4573-a126-230767690bb4</w:t>
       </w:r>
     </w:p>
     <w:p>
@@ -258,7 +258,7 @@
         <w:keepNext w:val="0"/>
       </w:pPr>
       <w:r>
-        <w:t>Reviewed source references: 2565821e-acdc-4cfb-b4a6-704b4f94c78b</w:t>
+        <w:t>Reviewed source references: caded7dc-f14d-4d3e-9103-8ceb4c8dd3ac</w:t>
       </w:r>
     </w:p>
     <w:p>
@@ -282,7 +282,7 @@
         <w:keepNext w:val="0"/>
       </w:pPr>
       <w:r>
-        <w:t>Reviewed source references: 74795bc1-871f-4bd2-90ec-7960aa8f7d68</w:t>
+        <w:t>Reviewed source references: 383073ea-6483-447a-8c74-fb38b6226a58</w:t>
       </w:r>
     </w:p>
     <w:p>
@@ -306,12 +306,12 @@
         <w:keepNext/>
       </w:pPr>
       <w:r>
-        <w:t>Reviewed source references: 74795bc1-871f-4bd2-90ec-7960aa8f7d68</w:t>
+        <w:t>Reviewed source references: 383073ea-6483-447a-8c74-fb38b6226a58</w:t>
       </w:r>
     </w:p>
     <w:p>
       <w:r>
-        <w:t>Calculation references: fd8d0166-654c-4cea-93eb-848d6a5dc84f</w:t>
+        <w:t>Calculation references: 59896288-0bc4-4ef3-9045-b5dfac9177de</w:t>
       </w:r>
     </w:p>
     <w:p>
@@ -335,7 +335,7 @@
         <w:keepNext w:val="0"/>
       </w:pPr>
       <w:r>
-        <w:t>Reviewed source references: 74795bc1-871f-4bd2-90ec-7960aa8f7d68</w:t>
+        <w:t>Reviewed source references: 383073ea-6483-447a-8c74-fb38b6226a58</w:t>
       </w:r>
     </w:p>
     <w:p>
@@ -359,7 +359,7 @@
         <w:keepNext w:val="0"/>
       </w:pPr>
       <w:r>
-        <w:t>Reviewed source references: 74795bc1-871f-4bd2-90ec-7960aa8f7d68</w:t>
+        <w:t>Reviewed source references: 383073ea-6483-447a-8c74-fb38b6226a58</w:t>
       </w:r>
     </w:p>
     <w:p>
@@ -383,7 +383,7 @@
         <w:keepNext w:val="0"/>
       </w:pPr>
       <w:r>
-        <w:t>Reviewed source references: 74795bc1-871f-4bd2-90ec-7960aa8f7d68</w:t>
+        <w:t>Reviewed source references: 383073ea-6483-447a-8c74-fb38b6226a58</w:t>
       </w:r>
     </w:p>
     <w:p>
@@ -499,7 +499,7 @@
       <w:pStyle w:val="Footer"/>
     </w:pPr>
     <w:r>
-      <w:t xml:space="preserve">AuditOS UAE | 2291dec1 | c4dc582a1c54e4fa | Page </w:t>
+      <w:t xml:space="preserve">AuditOS UAE | ecfbb0fa | 9f2c27d589631f58 | Page </w:t>
     </w:r>
     <w:fldSimple w:instr="PAGE"/>
   </w:p>

</xml_diff>

<commit_message>
Save latest country-source and tax reporting updates
</commit_message>
<xml_diff>
--- a/docs/phase-8/export-evidence/synthetic-localfile.docx
+++ b/docs/phase-8/export-evidence/synthetic-localfile.docx
@@ -27,17 +27,17 @@
     </w:p>
     <w:p>
       <w:r>
-        <w:t>Immutable calculation: ecfbb0fa-ebfc-407e-89ba-d1ce4da270fd. Methodology: auditos-tp/1.0.</w:t>
+        <w:t>Immutable calculation: 342f126e-d16f-4cac-bec8-2c13a4833ba3. Methodology: auditos-tp/1.0.</w:t>
       </w:r>
     </w:p>
     <w:p>
       <w:r>
-        <w:t>Approved financial source: c294c0ff-8c6f-4dff-8375-8f99c9058ca4. Source profit: 1200000.00000000.</w:t>
+        <w:t>Approved financial source: cf928a21-d968-43bd-af21-cbe63c33f5f4. Source profit: 1200000.00000000.</w:t>
       </w:r>
     </w:p>
     <w:p>
       <w:r>
-        <w:t>Financial reconciliation: 5361f161-7a01-4173-a92e-a24f2285d076.</w:t>
+        <w:t>Financial reconciliation: 3ad8dcc4-73bb-4757-860b-d47162b2a4cf.</w:t>
       </w:r>
     </w:p>
     <w:p>
@@ -61,7 +61,7 @@
         <w:keepNext w:val="0"/>
       </w:pPr>
       <w:r>
-        <w:t>Reviewed source references: 383073ea-6483-447a-8c74-fb38b6226a58</w:t>
+        <w:t>Reviewed source references: 26e3325b-a5cb-418e-8025-167c64388709</w:t>
       </w:r>
     </w:p>
     <w:p>
@@ -85,7 +85,7 @@
         <w:keepNext w:val="0"/>
       </w:pPr>
       <w:r>
-        <w:t>Reviewed source references: 383073ea-6483-447a-8c74-fb38b6226a58</w:t>
+        <w:t>Reviewed source references: 26e3325b-a5cb-418e-8025-167c64388709</w:t>
       </w:r>
     </w:p>
     <w:p>
@@ -109,7 +109,7 @@
         <w:keepNext w:val="0"/>
       </w:pPr>
       <w:r>
-        <w:t>Reviewed source references: 383073ea-6483-447a-8c74-fb38b6226a58</w:t>
+        <w:t>Reviewed source references: 26e3325b-a5cb-418e-8025-167c64388709</w:t>
       </w:r>
     </w:p>
     <w:p>
@@ -133,7 +133,7 @@
         <w:keepNext w:val="0"/>
       </w:pPr>
       <w:r>
-        <w:t>Reviewed source references: 383073ea-6483-447a-8c74-fb38b6226a58</w:t>
+        <w:t>Reviewed source references: 26e3325b-a5cb-418e-8025-167c64388709</w:t>
       </w:r>
     </w:p>
     <w:p>
@@ -157,7 +157,7 @@
         <w:keepNext w:val="0"/>
       </w:pPr>
       <w:r>
-        <w:t>Reviewed source references: 383073ea-6483-447a-8c74-fb38b6226a58</w:t>
+        <w:t>Reviewed source references: 26e3325b-a5cb-418e-8025-167c64388709</w:t>
       </w:r>
     </w:p>
     <w:p>
@@ -181,12 +181,12 @@
         <w:keepNext/>
       </w:pPr>
       <w:r>
-        <w:t>Reviewed source references: 383073ea-6483-447a-8c74-fb38b6226a58</w:t>
+        <w:t>Reviewed source references: 26e3325b-a5cb-418e-8025-167c64388709</w:t>
       </w:r>
     </w:p>
     <w:p>
       <w:r>
-        <w:t>Calculation references: 9f1251fa-b233-4ecd-9d23-99b681941173</w:t>
+        <w:t>Calculation references: 4728be13-cd4e-4cff-b944-aaa72314e339</w:t>
       </w:r>
     </w:p>
     <w:p>
@@ -210,7 +210,7 @@
         <w:keepNext w:val="0"/>
       </w:pPr>
       <w:r>
-        <w:t>Reviewed source references: 383073ea-6483-447a-8c74-fb38b6226a58</w:t>
+        <w:t>Reviewed source references: 26e3325b-a5cb-418e-8025-167c64388709</w:t>
       </w:r>
     </w:p>
     <w:p>
@@ -234,7 +234,7 @@
         <w:keepNext w:val="0"/>
       </w:pPr>
       <w:r>
-        <w:t>Reviewed source references: fdb9fdcd-b9c1-4573-a126-230767690bb4</w:t>
+        <w:t>Reviewed source references: e94f2c1e-966f-4abb-87a5-66d8467d8f35</w:t>
       </w:r>
     </w:p>
     <w:p>
@@ -258,7 +258,7 @@
         <w:keepNext w:val="0"/>
       </w:pPr>
       <w:r>
-        <w:t>Reviewed source references: caded7dc-f14d-4d3e-9103-8ceb4c8dd3ac</w:t>
+        <w:t>Reviewed source references: 98678ad6-7d06-424d-ac6a-0c1f973f72ed</w:t>
       </w:r>
     </w:p>
     <w:p>
@@ -282,7 +282,7 @@
         <w:keepNext w:val="0"/>
       </w:pPr>
       <w:r>
-        <w:t>Reviewed source references: 383073ea-6483-447a-8c74-fb38b6226a58</w:t>
+        <w:t>Reviewed source references: 26e3325b-a5cb-418e-8025-167c64388709</w:t>
       </w:r>
     </w:p>
     <w:p>
@@ -306,12 +306,12 @@
         <w:keepNext/>
       </w:pPr>
       <w:r>
-        <w:t>Reviewed source references: 383073ea-6483-447a-8c74-fb38b6226a58</w:t>
+        <w:t>Reviewed source references: 26e3325b-a5cb-418e-8025-167c64388709</w:t>
       </w:r>
     </w:p>
     <w:p>
       <w:r>
-        <w:t>Calculation references: 59896288-0bc4-4ef3-9045-b5dfac9177de</w:t>
+        <w:t>Calculation references: 8a856c62-8985-46d5-913a-50057385d3f4</w:t>
       </w:r>
     </w:p>
     <w:p>
@@ -335,7 +335,7 @@
         <w:keepNext w:val="0"/>
       </w:pPr>
       <w:r>
-        <w:t>Reviewed source references: 383073ea-6483-447a-8c74-fb38b6226a58</w:t>
+        <w:t>Reviewed source references: 26e3325b-a5cb-418e-8025-167c64388709</w:t>
       </w:r>
     </w:p>
     <w:p>
@@ -359,7 +359,7 @@
         <w:keepNext w:val="0"/>
       </w:pPr>
       <w:r>
-        <w:t>Reviewed source references: 383073ea-6483-447a-8c74-fb38b6226a58</w:t>
+        <w:t>Reviewed source references: 26e3325b-a5cb-418e-8025-167c64388709</w:t>
       </w:r>
     </w:p>
     <w:p>
@@ -383,7 +383,7 @@
         <w:keepNext w:val="0"/>
       </w:pPr>
       <w:r>
-        <w:t>Reviewed source references: 383073ea-6483-447a-8c74-fb38b6226a58</w:t>
+        <w:t>Reviewed source references: 26e3325b-a5cb-418e-8025-167c64388709</w:t>
       </w:r>
     </w:p>
     <w:p>
@@ -499,7 +499,7 @@
       <w:pStyle w:val="Footer"/>
     </w:pPr>
     <w:r>
-      <w:t xml:space="preserve">AuditOS UAE | ecfbb0fa | 9f2c27d589631f58 | Page </w:t>
+      <w:t xml:space="preserve">AuditOS UAE | 342f126e | 099843472321e21f | Page </w:t>
     </w:r>
     <w:fldSimple w:instr="PAGE"/>
   </w:p>

</xml_diff>

<commit_message>
Implement country workflows, accounting extensions and ML foundation
</commit_message>
<xml_diff>
--- a/docs/phase-8/export-evidence/synthetic-localfile.docx
+++ b/docs/phase-8/export-evidence/synthetic-localfile.docx
@@ -27,17 +27,17 @@
     </w:p>
     <w:p>
       <w:r>
-        <w:t>Immutable calculation: 342f126e-d16f-4cac-bec8-2c13a4833ba3. Methodology: auditos-tp/1.0.</w:t>
+        <w:t>Immutable calculation: 0258664f-47b6-46cf-ba0d-4b0c06ec4f67. Methodology: auditos-tp/1.0.</w:t>
       </w:r>
     </w:p>
     <w:p>
       <w:r>
-        <w:t>Approved financial source: cf928a21-d968-43bd-af21-cbe63c33f5f4. Source profit: 1200000.00000000.</w:t>
+        <w:t>Approved financial source: 0dc3d575-c9b9-4d71-bb27-b2b7bd223373. Source profit: 1200000.00000000.</w:t>
       </w:r>
     </w:p>
     <w:p>
       <w:r>
-        <w:t>Financial reconciliation: 3ad8dcc4-73bb-4757-860b-d47162b2a4cf.</w:t>
+        <w:t>Financial reconciliation: a068f299-a348-4b3c-bdd6-72eddf9ad9c2.</w:t>
       </w:r>
     </w:p>
     <w:p>
@@ -61,7 +61,7 @@
         <w:keepNext w:val="0"/>
       </w:pPr>
       <w:r>
-        <w:t>Reviewed source references: 26e3325b-a5cb-418e-8025-167c64388709</w:t>
+        <w:t>Reviewed source references: 3e14c2cf-ab13-4b8c-9cad-bb5430e0fce0</w:t>
       </w:r>
     </w:p>
     <w:p>
@@ -85,7 +85,7 @@
         <w:keepNext w:val="0"/>
       </w:pPr>
       <w:r>
-        <w:t>Reviewed source references: 26e3325b-a5cb-418e-8025-167c64388709</w:t>
+        <w:t>Reviewed source references: 3e14c2cf-ab13-4b8c-9cad-bb5430e0fce0</w:t>
       </w:r>
     </w:p>
     <w:p>
@@ -109,7 +109,7 @@
         <w:keepNext w:val="0"/>
       </w:pPr>
       <w:r>
-        <w:t>Reviewed source references: 26e3325b-a5cb-418e-8025-167c64388709</w:t>
+        <w:t>Reviewed source references: 3e14c2cf-ab13-4b8c-9cad-bb5430e0fce0</w:t>
       </w:r>
     </w:p>
     <w:p>
@@ -133,7 +133,7 @@
         <w:keepNext w:val="0"/>
       </w:pPr>
       <w:r>
-        <w:t>Reviewed source references: 26e3325b-a5cb-418e-8025-167c64388709</w:t>
+        <w:t>Reviewed source references: 3e14c2cf-ab13-4b8c-9cad-bb5430e0fce0</w:t>
       </w:r>
     </w:p>
     <w:p>
@@ -157,7 +157,7 @@
         <w:keepNext w:val="0"/>
       </w:pPr>
       <w:r>
-        <w:t>Reviewed source references: 26e3325b-a5cb-418e-8025-167c64388709</w:t>
+        <w:t>Reviewed source references: 3e14c2cf-ab13-4b8c-9cad-bb5430e0fce0</w:t>
       </w:r>
     </w:p>
     <w:p>
@@ -181,12 +181,12 @@
         <w:keepNext/>
       </w:pPr>
       <w:r>
-        <w:t>Reviewed source references: 26e3325b-a5cb-418e-8025-167c64388709</w:t>
+        <w:t>Reviewed source references: 3e14c2cf-ab13-4b8c-9cad-bb5430e0fce0</w:t>
       </w:r>
     </w:p>
     <w:p>
       <w:r>
-        <w:t>Calculation references: 4728be13-cd4e-4cff-b944-aaa72314e339</w:t>
+        <w:t>Calculation references: 3e0e7d7b-c078-41f1-887b-adbd588c0d57</w:t>
       </w:r>
     </w:p>
     <w:p>
@@ -210,7 +210,7 @@
         <w:keepNext w:val="0"/>
       </w:pPr>
       <w:r>
-        <w:t>Reviewed source references: 26e3325b-a5cb-418e-8025-167c64388709</w:t>
+        <w:t>Reviewed source references: 3e14c2cf-ab13-4b8c-9cad-bb5430e0fce0</w:t>
       </w:r>
     </w:p>
     <w:p>
@@ -234,7 +234,7 @@
         <w:keepNext w:val="0"/>
       </w:pPr>
       <w:r>
-        <w:t>Reviewed source references: e94f2c1e-966f-4abb-87a5-66d8467d8f35</w:t>
+        <w:t>Reviewed source references: 30e11100-a98b-4418-806b-7b0062760904</w:t>
       </w:r>
     </w:p>
     <w:p>
@@ -258,7 +258,7 @@
         <w:keepNext w:val="0"/>
       </w:pPr>
       <w:r>
-        <w:t>Reviewed source references: 98678ad6-7d06-424d-ac6a-0c1f973f72ed</w:t>
+        <w:t>Reviewed source references: 8f8e7a1e-a7bc-4812-91f0-d76c99dcf630</w:t>
       </w:r>
     </w:p>
     <w:p>
@@ -282,7 +282,7 @@
         <w:keepNext w:val="0"/>
       </w:pPr>
       <w:r>
-        <w:t>Reviewed source references: 26e3325b-a5cb-418e-8025-167c64388709</w:t>
+        <w:t>Reviewed source references: 3e14c2cf-ab13-4b8c-9cad-bb5430e0fce0</w:t>
       </w:r>
     </w:p>
     <w:p>
@@ -306,12 +306,12 @@
         <w:keepNext/>
       </w:pPr>
       <w:r>
-        <w:t>Reviewed source references: 26e3325b-a5cb-418e-8025-167c64388709</w:t>
+        <w:t>Reviewed source references: 3e14c2cf-ab13-4b8c-9cad-bb5430e0fce0</w:t>
       </w:r>
     </w:p>
     <w:p>
       <w:r>
-        <w:t>Calculation references: 8a856c62-8985-46d5-913a-50057385d3f4</w:t>
+        <w:t>Calculation references: 4852218e-f3f3-4ac7-93dc-f5a525cf96c5</w:t>
       </w:r>
     </w:p>
     <w:p>
@@ -335,7 +335,7 @@
         <w:keepNext w:val="0"/>
       </w:pPr>
       <w:r>
-        <w:t>Reviewed source references: 26e3325b-a5cb-418e-8025-167c64388709</w:t>
+        <w:t>Reviewed source references: 3e14c2cf-ab13-4b8c-9cad-bb5430e0fce0</w:t>
       </w:r>
     </w:p>
     <w:p>
@@ -359,7 +359,7 @@
         <w:keepNext w:val="0"/>
       </w:pPr>
       <w:r>
-        <w:t>Reviewed source references: 26e3325b-a5cb-418e-8025-167c64388709</w:t>
+        <w:t>Reviewed source references: 3e14c2cf-ab13-4b8c-9cad-bb5430e0fce0</w:t>
       </w:r>
     </w:p>
     <w:p>
@@ -383,7 +383,7 @@
         <w:keepNext w:val="0"/>
       </w:pPr>
       <w:r>
-        <w:t>Reviewed source references: 26e3325b-a5cb-418e-8025-167c64388709</w:t>
+        <w:t>Reviewed source references: 3e14c2cf-ab13-4b8c-9cad-bb5430e0fce0</w:t>
       </w:r>
     </w:p>
     <w:p>
@@ -499,7 +499,7 @@
       <w:pStyle w:val="Footer"/>
     </w:pPr>
     <w:r>
-      <w:t xml:space="preserve">AuditOS UAE | 342f126e | 099843472321e21f | Page </w:t>
+      <w:t xml:space="preserve">AuditOS UAE | 0258664f | a489c9f48f7cccb2 | Page </w:t>
     </w:r>
     <w:fldSimple w:instr="PAGE"/>
   </w:p>

</xml_diff>